<commit_message>
Add Word document version of PLSDA_SVM_NoSplit_Book2 script
https://claude.ai/code/session_01Xn4r78vBrFCZ6GbaAGxtCS
</commit_message>
<xml_diff>
--- a/PLSDA_SVM_NoSplit_Book2.docx
+++ b/PLSDA_SVM_NoSplit_Book2.docx
@@ -8,20 +8,9 @@
         <w:jc w:val="center"/>
       </w:pPr>
       <w:r>
-        <w:t>PLS-DA + SVM-RBF - Book2 - 100 Spectra</w:t>
+        <w:t>PLS-DA + SVM-RBF | NO TRAIN/TEST SPLIT | ALL 100 SPECTRA</w:t>
       </w:r>
     </w:p>
-    <w:p>
-      <w:r>
-        <w:t>Paste into a new PyCharm .py file and run.</w:t>
-      </w:r>
-    </w:p>
-    <w:p>
-      <w:r>
-        <w:t>Install: pip install pandas openpyxl scikit-learn scipy matplotlib</w:t>
-      </w:r>
-    </w:p>
-    <w:p/>
     <w:p>
       <w:r>
         <w:rPr>
@@ -147,7 +136,7 @@
         <w:br/>
         <w:t>SG_POLY        = 2</w:t>
         <w:br/>
-        <w:t>VIP_TOP_N      = 1800</w:t>
+        <w:t>VIP_TOP_N      = 1500</w:t>
         <w:br/>
         <w:t>N_COMPONENTS   = 5</w:t>
         <w:br/>

</xml_diff>